<commit_message>
Add link to Github in doc
</commit_message>
<xml_diff>
--- a/Assignment1/Home Assignment 1.docx
+++ b/Assignment1/Home Assignment 1.docx
@@ -287,15 +287,6 @@
         <w:spacing w:before="100" w:beforeAutospacing="on" w:after="100" w:afterAutospacing="on" w:line="240" w:lineRule="auto"/>
         <w:jc w:val="center"/>
         <w:outlineLvl w:val="1"/>
-        <w:rPr>
-          <w:rFonts w:ascii="Times New Roman" w:hAnsi="Times New Roman" w:eastAsia="Times New Roman" w:cs="Times New Roman"/>
-          <w:b w:val="1"/>
-          <w:bCs w:val="1"/>
-          <w:kern w:val="0"/>
-          <w:sz w:val="40"/>
-          <w:szCs w:val="40"/>
-          <w14:ligatures w14:val="none"/>
-        </w:rPr>
       </w:pPr>
       <w:r>
         <w:rPr>
@@ -319,6 +310,23 @@
         </w:rPr>
         <w:t xml:space="preserve"> Ian Pope</w:t>
       </w:r>
+    </w:p>
+    <w:p>
+      <w:pPr>
+        <w:spacing w:beforeAutospacing="on" w:afterAutospacing="on" w:line="240" w:lineRule="auto"/>
+        <w:jc w:val="center"/>
+        <w:outlineLvl w:val="1"/>
+      </w:pPr>
+      <w:hyperlink r:id="R896b7791d1e44d15">
+        <w:r>
+          <w:rPr>
+            <w:rStyle w:val="Hyperlink"/>
+            <w:b w:val="1"/>
+            <w:bCs w:val="1"/>
+          </w:rPr>
+          <w:t>https://github.com/ijp74190/Ian_Pope_F26_Neural_Networks/tree/main/Assignment1</w:t>
+        </w:r>
+      </w:hyperlink>
     </w:p>
     <w:p>
       <w:pPr>
@@ -6321,6 +6329,17 @@
       <w:szCs w:val="14"/>
     </w:rPr>
   </w:style>
+  <w:style w:type="character" w:styleId="Hyperlink">
+    <w:uiPriority w:val="99"/>
+    <w:name w:val="Hyperlink"/>
+    <w:basedOn w:val="DefaultParagraphFont"/>
+    <w:unhideWhenUsed/>
+    <w:rsid w:val="3701C599"/>
+    <w:rPr>
+      <w:color w:val="0563C1"/>
+      <w:u w:val="single"/>
+    </w:rPr>
+  </w:style>
 </w:styles>
 </file>
 

</xml_diff>